<commit_message>
Confirm ICO registration number ZC168720 in Privacy Policy (v1.2)
- privacy-policy.md: ICO number updated from placeholder to ZC168720;
  warning blockquote removed; version bumped to 1.2; last updated 17 Jun 2026
- grant-pathway-privacy-policy-v1.0.docx: regenerated from updated markdown
- ICO-registration-certificate-ZC168720.pdf: registration certificate added
  to docs/legal/ for reference
</commit_message>
<xml_diff>
--- a/docs/legal/grant-pathway-privacy-policy-v1.0.docx
+++ b/docs/legal/grant-pathway-privacy-policy-v1.0.docx
@@ -242,7 +242,7 @@
           <w:sz w:val="22"/>
           <w:szCs w:val="22"/>
         </w:rPr>
-        <w:t xml:space="preserve"> 1.1</w:t>
+        <w:t xml:space="preserve"> 1.2</w:t>
       </w:r>
     </w:p>
     <w:p>
@@ -272,7 +272,40 @@
           <w:sz w:val="22"/>
           <w:szCs w:val="22"/>
         </w:rPr>
-        <w:t xml:space="preserve">Last updated: 26 May 2026</w:t>
+        <w:t xml:space="preserve">Last updated: 17 June 2026</w:t>
+      </w:r>
+    </w:p>
+    <w:p>
+      <w:pPr>
+        <w:pBdr>
+          <w:left w:val="single" w:color="D47B00" w:sz="6" w:space="8"/>
+        </w:pBdr>
+        <w:spacing w:after="120" w:before="120"/>
+        <w:ind w:left="600"/>
+      </w:pPr>
+      <w:r>
+        <w:rPr>
+          <w:rFonts w:ascii="Calibri" w:cs="Calibri" w:eastAsia="Calibri" w:hAnsi="Calibri"/>
+          <w:b/>
+          <w:bCs/>
+          <w:i/>
+          <w:iCs/>
+          <w:color w:val="666666"/>
+          <w:sz w:val="18"/>
+          <w:szCs w:val="18"/>
+        </w:rPr>
+        <w:t xml:space="preserve">Change from v1.1 (26 May 2026):</w:t>
+      </w:r>
+      <w:r>
+        <w:rPr>
+          <w:rFonts w:ascii="Calibri" w:cs="Calibri" w:eastAsia="Calibri" w:hAnsi="Calibri"/>
+          <w:i/>
+          <w:iCs/>
+          <w:color w:val="666666"/>
+          <w:sz w:val="18"/>
+          <w:szCs w:val="18"/>
+        </w:rPr>
+        <w:t xml:space="preserve"> Section 1 updated to confirm ICO registration number ZC168720.</w:t>
       </w:r>
     </w:p>
     <w:p>
@@ -635,15 +668,7 @@
                 <w:sz w:val="20"/>
                 <w:szCs w:val="20"/>
               </w:rPr>
-              <w:t xml:space="preserve">[</w:t>
-            </w:r>
-            <w:r>
-              <w:rPr>
-                <w:rFonts w:ascii="Calibri" w:cs="Calibri" w:eastAsia="Calibri" w:hAnsi="Calibri"/>
-                <w:sz w:val="20"/>
-                <w:szCs w:val="20"/>
-              </w:rPr>
-              <w:t xml:space="preserve">TO BE CONFIRMED — see note below]</w:t>
+              <w:t xml:space="preserve">ZC168720</w:t>
             </w:r>
           </w:p>
         </w:tc>
@@ -717,64 +742,6 @@
       <w:pPr>
         <w:spacing w:after="160"/>
       </w:pPr>
-    </w:p>
-    <w:p>
-      <w:pPr>
-        <w:pBdr>
-          <w:left w:val="single" w:color="D47B00" w:sz="6" w:space="8"/>
-        </w:pBdr>
-        <w:spacing w:after="120" w:before="120"/>
-        <w:ind w:left="600"/>
-      </w:pPr>
-      <w:r>
-        <w:rPr>
-          <w:rFonts w:ascii="Calibri" w:cs="Calibri" w:eastAsia="Calibri" w:hAnsi="Calibri"/>
-          <w:b/>
-          <w:bCs/>
-          <w:i/>
-          <w:iCs/>
-          <w:color w:val="666666"/>
-          <w:sz w:val="18"/>
-          <w:szCs w:val="18"/>
-        </w:rPr>
-        <w:t xml:space="preserve">⚠ ICO registration:</w:t>
-      </w:r>
-      <w:r>
-        <w:rPr>
-          <w:rFonts w:ascii="Calibri" w:cs="Calibri" w:eastAsia="Calibri" w:hAnsi="Calibri"/>
-          <w:i/>
-          <w:iCs/>
-          <w:color w:val="666666"/>
-          <w:sz w:val="18"/>
-          <w:szCs w:val="18"/>
-        </w:rPr>
-        <w:t xml:space="preserve"> Processing personal data of UK individuals requires registration with the Information Commissioner's Office in most cases. Please confirm your ICO registration number before this policy goes live. Register or check your status at </w:t>
-      </w:r>
-      <w:hyperlink w:history="1" r:id="rIdqrhvbjv0q_aseqp73iuqg">
-        <w:r>
-          <w:rPr>
-            <w:rStyle w:val="Hyperlink"/>
-            <w:rFonts w:ascii="Calibri" w:cs="Calibri" w:eastAsia="Calibri" w:hAnsi="Calibri"/>
-            <w:i/>
-            <w:iCs/>
-            <w:color w:val="666666"/>
-            <w:sz w:val="18"/>
-            <w:szCs w:val="18"/>
-          </w:rPr>
-          <w:t xml:space="preserve">ico.org.uk</w:t>
-        </w:r>
-      </w:hyperlink>
-      <w:r>
-        <w:rPr>
-          <w:rFonts w:ascii="Calibri" w:cs="Calibri" w:eastAsia="Calibri" w:hAnsi="Calibri"/>
-          <w:i/>
-          <w:iCs/>
-          <w:color w:val="666666"/>
-          <w:sz w:val="18"/>
-          <w:szCs w:val="18"/>
-        </w:rPr>
-        <w:t xml:space="preserve">.</w:t>
-      </w:r>
     </w:p>
     <w:p>
       <w:pPr>
@@ -3592,7 +3559,7 @@
         </w:rPr>
         <w:t xml:space="preserve"> </w:t>
       </w:r>
-      <w:hyperlink w:history="1" r:id="rIdltb7qdar5e_gfxtw54o5n">
+      <w:hyperlink w:history="1" r:id="rIdb96mh5srqemokqtk7qlbx">
         <w:r>
           <w:rPr>
             <w:rStyle w:val="Hyperlink"/>
@@ -3707,7 +3674,7 @@
           <w:sz w:val="18"/>
           <w:szCs w:val="18"/>
         </w:rPr>
-        <w:t xml:space="preserve">Version: 1.1</w:t>
+        <w:t xml:space="preserve">Version: 1.2</w:t>
       </w:r>
     </w:p>
     <w:p>
@@ -3739,7 +3706,7 @@
           <w:sz w:val="18"/>
           <w:szCs w:val="18"/>
         </w:rPr>
-        <w:t xml:space="preserve">Last updated: 26 May 2026</w:t>
+        <w:t xml:space="preserve">Last updated: 17 June 2026</w:t>
       </w:r>
     </w:p>
     <w:sectPr>

</xml_diff>